<commit_message>
CV update and site map
</commit_message>
<xml_diff>
--- a/CV-and-CoverLetters/Michael Naidoo.docx
+++ b/CV-and-CoverLetters/Michael Naidoo.docx
@@ -264,24 +264,85 @@
                 <w:sz w:val="28"/>
                 <w:szCs w:val="28"/>
               </w:rPr>
-              <w:t>Sports Trading Analyst</w:t>
+              <w:t>Systems/UX Designer</w:t>
+            </w:r>
+          </w:p>
+          <w:p>
+            <w:pPr>
+              <w:pStyle w:val="Normal"/>
+            </w:pPr>
+            <w:r>
+              <w:rPr>
+                <w:rFonts w:ascii="Century Gothic" w:hAnsi="Century Gothic" w:eastAsia="Century Gothic" w:cs="Century Gothic"/>
+                <w:noProof w:val="0"/>
+                <w:sz w:val="20"/>
+                <w:szCs w:val="20"/>
+                <w:lang w:val="en-US"/>
+              </w:rPr>
+              <w:t xml:space="preserve">University </w:t>
+            </w:r>
+            <w:r>
+              <w:rPr>
+                <w:rFonts w:ascii="Century Gothic" w:hAnsi="Century Gothic" w:eastAsia="Century Gothic" w:cs="Century Gothic"/>
+                <w:noProof w:val="0"/>
+                <w:sz w:val="20"/>
+                <w:szCs w:val="20"/>
+                <w:lang w:val="en-US"/>
+              </w:rPr>
+              <w:t>graduate</w:t>
+            </w:r>
+            <w:r>
+              <w:rPr>
+                <w:rFonts w:ascii="Century Gothic" w:hAnsi="Century Gothic" w:eastAsia="Century Gothic" w:cs="Century Gothic"/>
+                <w:noProof w:val="0"/>
+                <w:sz w:val="20"/>
+                <w:szCs w:val="20"/>
+                <w:lang w:val="en-US"/>
+              </w:rPr>
+              <w:t xml:space="preserve"> with 4+ years of experience in system and experience design targeted towards the development of games. I am currently a trainer at </w:t>
+            </w:r>
+            <w:r>
+              <w:rPr>
+                <w:rFonts w:ascii="Century Gothic" w:hAnsi="Century Gothic" w:eastAsia="Century Gothic" w:cs="Century Gothic"/>
+                <w:noProof w:val="0"/>
+                <w:sz w:val="20"/>
+                <w:szCs w:val="20"/>
+                <w:lang w:val="en-US"/>
+              </w:rPr>
+              <w:t>Logiscool</w:t>
+            </w:r>
+            <w:r>
+              <w:rPr>
+                <w:rFonts w:ascii="Century Gothic" w:hAnsi="Century Gothic" w:eastAsia="Century Gothic" w:cs="Century Gothic"/>
+                <w:noProof w:val="0"/>
+                <w:sz w:val="20"/>
+                <w:szCs w:val="20"/>
+                <w:lang w:val="en-US"/>
+              </w:rPr>
+              <w:t xml:space="preserve">, having previously worked in a similar position at the company's Bedfored View branch. Between the two positions, I served as the Wits Sports Council Secretary and the Wits Tang Soo Do Club </w:t>
+            </w:r>
+            <w:r>
+              <w:rPr>
+                <w:rFonts w:ascii="Century Gothic" w:hAnsi="Century Gothic" w:eastAsia="Century Gothic" w:cs="Century Gothic"/>
+                <w:noProof w:val="0"/>
+                <w:sz w:val="20"/>
+                <w:szCs w:val="20"/>
+                <w:lang w:val="en-US"/>
+              </w:rPr>
+              <w:t>Chairman</w:t>
+            </w:r>
+            <w:r>
+              <w:rPr>
+                <w:rFonts w:ascii="Century Gothic" w:hAnsi="Century Gothic" w:eastAsia="Century Gothic" w:cs="Century Gothic"/>
+                <w:noProof w:val="0"/>
+                <w:sz w:val="20"/>
+                <w:szCs w:val="20"/>
+                <w:lang w:val="en-US"/>
+              </w:rPr>
+              <w:t>. I am an aspiring System/UX Designer with an expressed interest in how users experience the system I create.</w:t>
             </w:r>
           </w:p>
           <w:p/>
-          <w:p>
-            <w:r>
-              <w:rPr/>
-              <w:t xml:space="preserve">Strategic analyst bridging the gap between system design and sports data. With a foundation in Python-based predictive modeling and advanced Excel, I specialize in translating complex cricket variables into actionable trading insights. As former Secretary of the Wits Sports Council, I managed high-level organizational systems, while my role as a </w:t>
-            </w:r>
-            <w:r>
-              <w:rPr/>
-              <w:t>Logiscool</w:t>
-            </w:r>
-            <w:r>
-              <w:rPr/>
-              <w:t xml:space="preserve"> Trainer perfected my ability to communicate technical data to diverse audiences. I thrive in high-pressure environments, combining the precision of a system designer with the tactical intuition of a lifelong cricket enthusiast.</w:t>
-            </w:r>
-          </w:p>
         </w:tc>
       </w:tr>
       <w:tr>
@@ -357,8 +418,38 @@
           </w:p>
           <w:p>
             <w:pPr>
-              <w:pStyle w:val="Heading1"/>
-            </w:pPr>
+              <w:pStyle w:val="Normal"/>
+            </w:pPr>
+            <w:r>
+              <w:br/>
+            </w:r>
+            <w:r>
+              <w:rPr/>
+              <w:t>CS50 Introduction to Computer Science</w:t>
+            </w:r>
+          </w:p>
+          <w:p>
+            <w:pPr>
+              <w:pStyle w:val="Normal"/>
+            </w:pPr>
+            <w:r>
+              <w:rPr/>
+              <w:t>University of Harvard via Edx</w:t>
+            </w:r>
+          </w:p>
+          <w:p>
+            <w:pPr>
+              <w:pStyle w:val="Normal"/>
+              <w:suppressLineNumbers w:val="0"/>
+              <w:bidi w:val="0"/>
+              <w:spacing w:before="0" w:beforeAutospacing="off" w:after="0" w:afterAutospacing="off" w:line="264" w:lineRule="auto"/>
+              <w:ind w:left="0" w:right="0"/>
+              <w:jc w:val="left"/>
+            </w:pPr>
+            <w:r>
+              <w:rPr/>
+              <w:t>2026 – now</w:t>
+            </w:r>
           </w:p>
           <w:p>
             <w:pPr>
@@ -376,6 +467,46 @@
                 <w:szCs w:val="20"/>
               </w:rPr>
             </w:pPr>
+          </w:p>
+          <w:p>
+            <w:pPr>
+              <w:pStyle w:val="ListBullet"/>
+              <w:rPr/>
+            </w:pPr>
+            <w:r>
+              <w:rPr/>
+              <w:t>C#</w:t>
+            </w:r>
+          </w:p>
+          <w:p>
+            <w:pPr>
+              <w:pStyle w:val="ListBullet"/>
+              <w:rPr/>
+            </w:pPr>
+            <w:r>
+              <w:rPr/>
+              <w:t>Python</w:t>
+            </w:r>
+          </w:p>
+          <w:p>
+            <w:pPr>
+              <w:pStyle w:val="ListBullet"/>
+              <w:rPr/>
+            </w:pPr>
+            <w:r>
+              <w:rPr/>
+              <w:t>HTML</w:t>
+            </w:r>
+          </w:p>
+          <w:p>
+            <w:pPr>
+              <w:pStyle w:val="ListBullet"/>
+              <w:rPr/>
+            </w:pPr>
+            <w:r>
+              <w:rPr/>
+              <w:t>CSS</w:t>
+            </w:r>
           </w:p>
           <w:p>
             <w:pPr>

</xml_diff>